<commit_message>
Refinements to weekly outlook coverage
</commit_message>
<xml_diff>
--- a/exports/2026-05-26_eight-weeks-pce-must-confirm.docx
+++ b/exports/2026-05-26_eight-weeks-pce-must-confirm.docx
@@ -1476,7 +1476,7 @@
         <w:pStyle w:val="FirstParagraph"/>
       </w:pPr>
       <w:r>
-        <w:t xml:space="preserve">The trade isn't to fight the print — the fundamentals are intact — but it isn't to chase here either. We want a pullback to the May 13 level (~$162) on any PCE hot print or broader AI-capex jitter to add. Full thesis still lives in the</w:t>
+        <w:t xml:space="preserve">The trade isn't to fight the print — the fundamentals are intact — but it isn't to chase here either. We want a pullback to the May 13 support zone on any PCE hot print or broader AI-capex jitter to add. Full thesis still lives in the</w:t>
       </w:r>
       <w:r>
         <w:t xml:space="preserve"> </w:t>
@@ -2671,13 +2671,13 @@
         <w:rPr>
           <w:b/>
         </w:rPr>
-        <w:t xml:space="preserve">If we get scenario 3 (PCE &gt; 2.8%), add NVDA at $162, AMD at $115, MU at $115.</w:t>
-      </w:r>
-      <w:r>
-        <w:t xml:space="preserve"> </w:t>
-      </w:r>
-      <w:r>
-        <w:t xml:space="preserve">These are the May 9–13 lows on the three core supercycle names. A 3% pullback from current levels into Friday on a hot print is the buyable setup we've been waiting for.</w:t>
+        <w:t xml:space="preserve">If we get scenario 3 (PCE &gt; 2.8%), add the three core supercycle names (NVDA, AMD, MU) on a retest of the May 9–13 lows.</w:t>
+      </w:r>
+      <w:r>
+        <w:t xml:space="preserve"> </w:t>
+      </w:r>
+      <w:r>
+        <w:t xml:space="preserve">Those are roughly 3–5% pullbacks from current levels — the support range that has held twice this cycle and is the buyable setup we've been waiting for.</w:t>
       </w:r>
     </w:p>
     <w:p>

</xml_diff>